<commit_message>
Add: Yoon et al.(2020) 서론 인용 확정 반영
IPCC(2022) 옆에 국내 폭염 실증 데이터(Yoon et al. 2020, Climate
Dynamics) 추가 — 마스터 초안·마스터 인용파일·서론 인용근거정리 보조
파일 모두 갱신. 이로써 서론 관련 미확정 항목 전부 해소.
</commit_message>
<xml_diff>
--- a/writing/01_서론/2026-08-04_서론_인용근거정리.docx
+++ b/writing/01_서론/2026-08-04_서론_인용근거정리.docx
@@ -908,13 +908,13 @@
         </w:tc>
       </w:tr>
     </w:tbl>
-    <w:bookmarkStart w:id="9" w:name="보강-제안-1-yoon-et-al.-2020을-ipcc2022-옆에-추가"/>
+    <w:bookmarkStart w:id="9" w:name="반영-완료-yoon-et-al.-2020-2026-08-04"/>
     <w:p>
       <w:pPr>
         <w:pStyle w:val="Heading3"/>
       </w:pPr>
       <w:r>
-        <w:t xml:space="preserve">➕ 보강 제안 1 — Yoon et al. (2020)을 IPCC(2022) 옆에 추가</w:t>
+        <w:t xml:space="preserve">✅ 반영 완료 — Yoon et al. (2020) (2026-08-04)</w:t>
       </w:r>
     </w:p>
     <w:p>
@@ -962,34 +962,22 @@
           <w:b/>
           <w:bCs/>
         </w:rPr>
-        <w:t xml:space="preserve">상태</w:t>
-      </w:r>
-      <w:r>
-        <w:t xml:space="preserve">: 이미</w:t>
-      </w:r>
-      <w:r>
-        <w:t xml:space="preserve"> </w:t>
-      </w:r>
-      <w:r>
-        <w:rPr>
-          <w:rStyle w:val="VerbatimChar"/>
-        </w:rPr>
-        <w:t xml:space="preserve">references/all_papers/Yoon2020_HeatwaveKorea.pdf</w:t>
-      </w:r>
-      <w:r>
-        <w:t xml:space="preserve">로 확보되어 있고</w:t>
-      </w:r>
-      <w:r>
-        <w:t xml:space="preserve"> </w:t>
-      </w:r>
-      <w:r>
-        <w:rPr>
-          <w:rStyle w:val="VerbatimChar"/>
-        </w:rPr>
-        <w:t xml:space="preserve">reference_list.csv</w:t>
-      </w:r>
-      <w:r>
-        <w:t xml:space="preserve">(id 030)에도 등재되어 있으나, 정작 서론 어디에도 실제로 인용되어 있지 않음(등재만 되고 미사용).</w:t>
+        <w:t xml:space="preserve">원문 근거(Abstract 직접 확인)</w:t>
+      </w:r>
+      <w:r>
+        <w:t xml:space="preserve">:</w:t>
+      </w:r>
+      <w:r>
+        <w:t xml:space="preserve"> </w:t>
+      </w:r>
+      <w:r>
+        <w:t xml:space="preserve">“Global warming and abnormal climate change have resulted in an increase in the frequency of severe heatwave events. Recently, a series of extreme heatwave events have occurred in South Korea, and the damage from these events has also been increasing.”</w:t>
+      </w:r>
+      <w:r>
+        <w:t xml:space="preserve"> </w:t>
+      </w:r>
+      <w:r>
+        <w:t xml:space="preserve">군집분석으로 2000~2018년 한국 폭염일수가 1981~1999년 대비 유의하게 증가했음을 실증(카나차카반도 지위고도 이상과 연관된 cluster 2 유형).</w:t>
       </w:r>
     </w:p>
     <w:p>
@@ -1005,7 +993,7 @@
           <w:b/>
           <w:bCs/>
         </w:rPr>
-        <w:t xml:space="preserve">원문 근거(Abstract 직접 확인)</w:t>
+        <w:t xml:space="preserve">반영 문구(마스터 초안 확정)</w:t>
       </w:r>
       <w:r>
         <w:t xml:space="preserve">:</w:t>
@@ -1014,13 +1002,7 @@
         <w:t xml:space="preserve"> </w:t>
       </w:r>
       <w:r>
-        <w:t xml:space="preserve">“Global warming and abnormal climate change have resulted in an increase in the frequency of severe heatwave events. Recently, a series of extreme heatwave events have occurred in South Korea, and the damage from these events has also been increasing.”</w:t>
-      </w:r>
-      <w:r>
-        <w:t xml:space="preserve"> </w:t>
-      </w:r>
-      <w:r>
-        <w:t xml:space="preserve">군집분석으로 2000~2018년 한국 폭염일수가 1981~1999년 대비 유의하게 증가했음을 실증(카나차카반도 지위고도 이상과 연관된 cluster 2 유형).</w:t>
+        <w:t xml:space="preserve">“…도시 내 폭염의 빈도와 강도는 더욱 증가하는 추세이며(IPCC, 2022), 국내에서도 최근 폭염일수가 과거 대비 유의하게 증가하는 것으로 확인된다(Yoon et al., 2020).”</w:t>
       </w:r>
     </w:p>
     <w:p>
@@ -1036,57 +1018,10 @@
           <w:b/>
           <w:bCs/>
         </w:rPr>
-        <w:t xml:space="preserve">왜 추가하면 좋은가</w:t>
-      </w:r>
-      <w:r>
-        <w:t xml:space="preserve">: 지금</w:t>
-      </w:r>
-      <w:r>
-        <w:t xml:space="preserve"> </w:t>
-      </w:r>
-      <w:r>
-        <w:t xml:space="preserve">“기후변화로 인해 도시 내 폭염의 빈도와 강도는 더욱 증가하는 추세이며(IPCC, 2022)”</w:t>
-      </w:r>
-      <w:r>
-        <w:t xml:space="preserve">는 전지구적 일반론뿐이라, 바로 다음 문장인 서울/한국 사례로 넘어가기 전에</w:t>
-      </w:r>
-      <w:r>
-        <w:t xml:space="preserve"> </w:t>
-      </w:r>
-      <w:r>
-        <w:rPr>
-          <w:b/>
-          <w:bCs/>
-        </w:rPr>
-        <w:t xml:space="preserve">한국 특정적 실증 데이터</w:t>
-      </w:r>
-      <w:r>
-        <w:t xml:space="preserve">가 한 번 받쳐주면 논리가 더 촘촘해짐.</w:t>
-      </w:r>
-    </w:p>
-    <w:p>
-      <w:pPr>
-        <w:pStyle w:val="Compact"/>
-        <w:numPr>
-          <w:ilvl w:val="0"/>
-          <w:numId w:val="1001"/>
-        </w:numPr>
-      </w:pPr>
-      <w:r>
-        <w:rPr>
-          <w:b/>
-          <w:bCs/>
-        </w:rPr>
-        <w:t xml:space="preserve">제안 문구</w:t>
-      </w:r>
-      <w:r>
-        <w:t xml:space="preserve">:</w:t>
-      </w:r>
-      <w:r>
-        <w:t xml:space="preserve"> </w:t>
-      </w:r>
-      <w:r>
-        <w:t xml:space="preserve">“…도시 내 폭염의 빈도와 강도는 더욱 증가하는 추세이며(IPCC, 2022), 국내에서도 최근 폭염일수가 과거 대비 유의하게 증가하는 것으로 확인된다(Yoon et al., 2020).”</w:t>
+        <w:t xml:space="preserve">확인</w:t>
+      </w:r>
+      <w:r>
+        <w:t xml:space="preserve">: 사용자 확인 완료(2026-08-04), 마스터초안·마스터인용파일 모두 반영</w:t>
       </w:r>
     </w:p>
     <w:bookmarkEnd w:id="9"/>
@@ -2106,14 +2041,7 @@
               <w:pStyle w:val="Compact"/>
             </w:pPr>
             <w:r>
-              <w:rPr>
-                <w:b/>
-                <w:bCs/>
-              </w:rPr>
-              <w:t xml:space="preserve">미결 — Yoon et al.(2020) 추가 제안</w:t>
-            </w:r>
-            <w:r>
-              <w:t xml:space="preserve">(이미 확보된 문헌, 사용자 확인 대기 중)</w:t>
+              <w:t xml:space="preserve">✅ Yoon et al.(2020) 추가 — 마스터 초안 반영 완료 (2026-08-04)</w:t>
             </w:r>
           </w:p>
         </w:tc>
@@ -2124,7 +2052,7 @@
         <w:pStyle w:val="BodyText"/>
       </w:pPr>
       <w:r>
-        <w:t xml:space="preserve">이 중 4번(Yoon et al. 2020 추가)은 근거가 확실하니 바로 반영해도 될 것 같고, 1~3번은 교수님과 상의해서 원문 재확인 또는 표현 조정 방향을 정하면 좋을 것 같습니다.</w:t>
+        <w:t xml:space="preserve">4건 전부 해결됨. 서론 인용 관련 미확정 항목 없음(2026-08-04 기준).</w:t>
       </w:r>
     </w:p>
     <w:bookmarkEnd w:id="17"/>

</xml_diff>